<commit_message>
Humanizer lượt 2: sửa 3 chỗ còn sót
- Bỏ 'giữ vai trò' (§18), dùng động từ thẳng
- Bỏ dòng mồ côi dưới tiêu đề 4.4 (§24), thông tin đã có ở 2 chỗ khác
- Bỏ 'đáng được nhấn mạnh' (§13), nêu thẳng lý do

Co-Authored-By: Claude Opus 5 <noreply@anthropic.com>
</commit_message>
<xml_diff>
--- a/Doan/06-BaoCao/dan-y-bao-cao.docx
+++ b/Doan/06-BaoCao/dan-y-bao-cao.docx
@@ -453,7 +453,7 @@
         <w:spacing w:after="140"/>
       </w:pPr>
       <w:r>
-        <w:t xml:space="preserve">Bốn công đoạn này giữ vai trò khác nhau ở từng chương:</w:t>
+        <w:t xml:space="preserve">Mỗi chương dùng bốn công đoạn này theo một cách khác nhau:</w:t>
       </w:r>
     </w:p>
     <w:tbl>
@@ -16612,14 +16612,6 @@
     </w:p>
     <w:p>
       <w:pPr>
-        <w:spacing w:after="140"/>
-      </w:pPr>
-      <w:r>
-        <w:t xml:space="preserve">Giảng viên nhấn mạnh mục này tại Lưu ý 6.</w:t>
-      </w:r>
-    </w:p>
-    <w:p>
-      <w:pPr>
         <w:pStyle w:val="Heading4"/>
       </w:pPr>
       <w:r>
@@ -17565,7 +17557,7 @@
         <w:spacing w:after="140"/>
       </w:pPr>
       <w:r>
-        <w:t xml:space="preserve">Trong năm độ đo trên, số lần truy vấn mạng mỗi tia đáng được nhấn mạnh vì nó không phụ thuộc phần cứng, qua đó khắc phục được vấn đề mỗi công trình đo trên một cấu hình khác nhau.</w:t>
+        <w:t xml:space="preserve">Trong năm độ đo trên, số lần truy vấn mạng mỗi tia không phụ thuộc phần cứng, nên so sánh được giữa các công trình đo trên cấu hình khác nhau.</w:t>
       </w:r>
     </w:p>
     <w:p>

</xml_diff>